<commit_message>
Finalize Client App wireframe dashboard, Helpdesk Client ID, Admin search filtering, 1-time silent location sync, and comprehensive Master Specification Documentation
</commit_message>
<xml_diff>
--- a/kaam_Master_Project_Standard_Specification.docx
+++ b/kaam_Master_Project_Standard_Specification.docx
@@ -485,7 +485,7 @@
           <w:color w:val="2D1B4E"/>
           <w:sz w:val="32"/>
         </w:rPr>
-        <w:t>2. Exhaustive Record of What We Have Accomplished</w:t>
+        <w:t>2. Exhaustive Record of Implemented Systems &amp; Features</w:t>
       </w:r>
     </w:p>
     <w:p>
@@ -500,7 +500,351 @@
           <w:color w:val="913B82"/>
           <w:sz w:val="25"/>
         </w:rPr>
-        <w:t>A. Authentication &amp; Security Systems</w:t>
+        <w:t>A. Client App Dashboard &amp; Wireframe Implementation (Port 5174)</w:t>
+      </w:r>
+    </w:p>
+    <w:p>
+      <w:pPr>
+        <w:spacing w:after="80" w:line="276" w:lineRule="auto"/>
+      </w:pPr>
+      <w:r>
+        <w:rPr>
+          <w:rFonts w:ascii="Arial" w:hAnsi="Arial"/>
+          <w:b/>
+          <w:color w:val="1E293B"/>
+          <w:sz w:val="19"/>
+        </w:rPr>
+        <w:t xml:space="preserve">• Wireframe-Compliant Layout: </w:t>
+      </w:r>
+      <w:r>
+        <w:rPr>
+          <w:rFonts w:ascii="Arial" w:hAnsi="Arial"/>
+          <w:i w:val="0"/>
+          <w:color w:val="1E293B"/>
+          <w:sz w:val="19"/>
+        </w:rPr>
+        <w:t>Constructed strictly to match the client wireframe diagram, featuring Upper-Left Profile button, Prominent Center 'Search Worker' bar, Category Filter Pills, and Right Tabs.</w:t>
+      </w:r>
+    </w:p>
+    <w:p>
+      <w:pPr>
+        <w:spacing w:after="80" w:line="276" w:lineRule="auto"/>
+      </w:pPr>
+      <w:r>
+        <w:rPr>
+          <w:rFonts w:ascii="Arial" w:hAnsi="Arial"/>
+          <w:b/>
+          <w:color w:val="1E293B"/>
+          <w:sz w:val="19"/>
+        </w:rPr>
+        <w:t xml:space="preserve">• Official Client ID Display: </w:t>
+      </w:r>
+      <w:r>
+        <w:rPr>
+          <w:rFonts w:ascii="Arial" w:hAnsi="Arial"/>
+          <w:i w:val="0"/>
+          <w:color w:val="1E293B"/>
+          <w:sz w:val="19"/>
+        </w:rPr>
+        <w:t>Non-editable sequential identifier (e.g. Client ID: 001) displayed as a clean inline text line for helpdesk support and rapid admin lookup.</w:t>
+      </w:r>
+    </w:p>
+    <w:p>
+      <w:pPr>
+        <w:spacing w:after="80" w:line="276" w:lineRule="auto"/>
+      </w:pPr>
+      <w:r>
+        <w:rPr>
+          <w:rFonts w:ascii="Arial" w:hAnsi="Arial"/>
+          <w:b/>
+          <w:color w:val="1E293B"/>
+          <w:sz w:val="19"/>
+        </w:rPr>
+        <w:t xml:space="preserve">• Client Profile &amp; Address Sync: </w:t>
+      </w:r>
+      <w:r>
+        <w:rPr>
+          <w:rFonts w:ascii="Arial" w:hAnsi="Arial"/>
+          <w:i w:val="0"/>
+          <w:color w:val="1E293B"/>
+          <w:sz w:val="19"/>
+        </w:rPr>
+        <w:t>Interactive modal allowing clients to update Full Name, Primary/Secondary Phone, Locality, Landmark, State (22 Indian States), and Pincode with instant server persistence.</w:t>
+      </w:r>
+    </w:p>
+    <w:p>
+      <w:pPr>
+        <w:spacing w:after="80" w:line="276" w:lineRule="auto"/>
+      </w:pPr>
+      <w:r>
+        <w:rPr>
+          <w:rFonts w:ascii="Arial" w:hAnsi="Arial"/>
+          <w:b/>
+          <w:color w:val="1E293B"/>
+          <w:sz w:val="19"/>
+        </w:rPr>
+        <w:t xml:space="preserve">• Live Search &amp; Default/Filtered States: </w:t>
+      </w:r>
+      <w:r>
+        <w:rPr>
+          <w:rFonts w:ascii="Arial" w:hAnsi="Arial"/>
+          <w:i w:val="0"/>
+          <w:color w:val="1E293B"/>
+          <w:sz w:val="19"/>
+        </w:rPr>
+        <w:t>Instant live filtering by trade category, worker name, or locality with an active search indicator and a 1-click 'Show Default List' reset pill.</w:t>
+      </w:r>
+    </w:p>
+    <w:p>
+      <w:pPr>
+        <w:spacing w:after="80" w:line="276" w:lineRule="auto"/>
+      </w:pPr>
+      <w:r>
+        <w:rPr>
+          <w:rFonts w:ascii="Arial" w:hAnsi="Arial"/>
+          <w:b/>
+          <w:color w:val="1E293B"/>
+          <w:sz w:val="19"/>
+        </w:rPr>
+        <w:t xml:space="preserve">• Worker Detailed Profile View Modal: </w:t>
+      </w:r>
+      <w:r>
+        <w:rPr>
+          <w:rFonts w:ascii="Arial" w:hAnsi="Arial"/>
+          <w:i w:val="0"/>
+          <w:color w:val="1E293B"/>
+          <w:sz w:val="19"/>
+        </w:rPr>
+        <w:t>Replaced direct hiring with a comprehensive profile view displaying worker avatar, KYC verified badge, bio, client rating (★ 4.9), daily/hourly rates, and photo gallery before booking.</w:t>
+      </w:r>
+    </w:p>
+    <w:p>
+      <w:pPr>
+        <w:spacing w:after="80" w:line="276" w:lineRule="auto"/>
+      </w:pPr>
+      <w:r>
+        <w:rPr>
+          <w:rFonts w:ascii="Arial" w:hAnsi="Arial"/>
+          <w:b/>
+          <w:color w:val="1E293B"/>
+          <w:sz w:val="19"/>
+        </w:rPr>
+        <w:t xml:space="preserve">• Permanent Account Deletion: </w:t>
+      </w:r>
+      <w:r>
+        <w:rPr>
+          <w:rFonts w:ascii="Arial" w:hAnsi="Arial"/>
+          <w:i w:val="0"/>
+          <w:color w:val="1E293B"/>
+          <w:sz w:val="19"/>
+        </w:rPr>
+        <w:t>Added red confirmation modal and backend API endpoint (DELETE /api/auth/delete-account) allowing clients to permanently erase their account.</w:t>
+      </w:r>
+    </w:p>
+    <w:p>
+      <w:pPr>
+        <w:pStyle w:val="Heading2"/>
+        <w:spacing w:before="280" w:after="80"/>
+      </w:pPr>
+      <w:r>
+        <w:rPr>
+          <w:rFonts w:ascii="Arial" w:hAnsi="Arial"/>
+          <w:b/>
+          <w:color w:val="913B82"/>
+          <w:sz w:val="25"/>
+        </w:rPr>
+        <w:t>B. Master Admin Portal &amp; Client Management (Port 5176)</w:t>
+      </w:r>
+    </w:p>
+    <w:p>
+      <w:pPr>
+        <w:spacing w:after="80" w:line="276" w:lineRule="auto"/>
+      </w:pPr>
+      <w:r>
+        <w:rPr>
+          <w:rFonts w:ascii="Arial" w:hAnsi="Arial"/>
+          <w:b/>
+          <w:color w:val="1E293B"/>
+          <w:sz w:val="19"/>
+        </w:rPr>
+        <w:t xml:space="preserve">• Upgraded Client Accounts Table: </w:t>
+      </w:r>
+      <w:r>
+        <w:rPr>
+          <w:rFonts w:ascii="Arial" w:hAnsi="Arial"/>
+          <w:i w:val="0"/>
+          <w:color w:val="1E293B"/>
+          <w:sz w:val="19"/>
+        </w:rPr>
+        <w:t>Displays sequential Client IDs (001, 002, 003...), Client Name, masked phone numbers (96706 *** ** with Eye toggle), and [ View Profile ] modal.</w:t>
+      </w:r>
+    </w:p>
+    <w:p>
+      <w:pPr>
+        <w:spacing w:after="80" w:line="276" w:lineRule="auto"/>
+      </w:pPr>
+      <w:r>
+        <w:rPr>
+          <w:rFonts w:ascii="Arial" w:hAnsi="Arial"/>
+          <w:b/>
+          <w:color w:val="1E293B"/>
+          <w:sz w:val="19"/>
+        </w:rPr>
+        <w:t xml:space="preserve">• Strict Client ID &amp; Name Search: </w:t>
+      </w:r>
+      <w:r>
+        <w:rPr>
+          <w:rFonts w:ascii="Arial" w:hAnsi="Arial"/>
+          <w:i w:val="0"/>
+          <w:color w:val="1E293B"/>
+          <w:sz w:val="19"/>
+        </w:rPr>
+        <w:t>Implemented strict search filtering matching exclusively by sequential Client ID (001, 002...) or Client Name, maintaining permanent fixed IDs when filtered.</w:t>
+      </w:r>
+    </w:p>
+    <w:p>
+      <w:pPr>
+        <w:spacing w:after="80" w:line="276" w:lineRule="auto"/>
+      </w:pPr>
+      <w:r>
+        <w:rPr>
+          <w:rFonts w:ascii="Arial" w:hAnsi="Arial"/>
+          <w:b/>
+          <w:color w:val="1E293B"/>
+          <w:sz w:val="19"/>
+        </w:rPr>
+        <w:t xml:space="preserve">• Admin Security &amp; Authentication: </w:t>
+      </w:r>
+      <w:r>
+        <w:rPr>
+          <w:rFonts w:ascii="Arial" w:hAnsi="Arial"/>
+          <w:i w:val="0"/>
+          <w:color w:val="1E293B"/>
+          <w:sz w:val="19"/>
+        </w:rPr>
+        <w:t>Full authentication console for Surya-4034 with bcrypt verification, Gmail secret code dispatch, password visibility toggles, and live stats polling.</w:t>
+      </w:r>
+    </w:p>
+    <w:p>
+      <w:pPr>
+        <w:pStyle w:val="Heading2"/>
+        <w:spacing w:before="280" w:after="80"/>
+      </w:pPr>
+      <w:r>
+        <w:rPr>
+          <w:rFonts w:ascii="Arial" w:hAnsi="Arial"/>
+          <w:b/>
+          <w:color w:val="913B82"/>
+          <w:sz w:val="25"/>
+        </w:rPr>
+        <w:t>C. 1-Time Silent Live Geolocation Background Synchronization</w:t>
+      </w:r>
+    </w:p>
+    <w:p>
+      <w:pPr>
+        <w:spacing w:after="80" w:line="276" w:lineRule="auto"/>
+      </w:pPr>
+      <w:r>
+        <w:rPr>
+          <w:rFonts w:ascii="Arial" w:hAnsi="Arial"/>
+          <w:b/>
+          <w:color w:val="1E293B"/>
+          <w:sz w:val="19"/>
+        </w:rPr>
+        <w:t xml:space="preserve">• Zero UI Hints / Silent Execution: </w:t>
+      </w:r>
+      <w:r>
+        <w:rPr>
+          <w:rFonts w:ascii="Arial" w:hAnsi="Arial"/>
+          <w:i w:val="0"/>
+          <w:color w:val="1E293B"/>
+          <w:sz w:val="19"/>
+        </w:rPr>
+        <w:t>Requests browser geolocation once upon user login without showing any banners, alerts, or hints on screen, maintaining an unobtrusive user experience.</w:t>
+      </w:r>
+    </w:p>
+    <w:p>
+      <w:pPr>
+        <w:spacing w:after="80" w:line="276" w:lineRule="auto"/>
+      </w:pPr>
+      <w:r>
+        <w:rPr>
+          <w:rFonts w:ascii="Arial" w:hAnsi="Arial"/>
+          <w:b/>
+          <w:color w:val="1E293B"/>
+          <w:sz w:val="19"/>
+        </w:rPr>
+        <w:t xml:space="preserve">• Single-Prompt Storage Guarantee: </w:t>
+      </w:r>
+      <w:r>
+        <w:rPr>
+          <w:rFonts w:ascii="Arial" w:hAnsi="Arial"/>
+          <w:i w:val="0"/>
+          <w:color w:val="1E293B"/>
+          <w:sz w:val="19"/>
+        </w:rPr>
+        <w:t>Stores a persistent flag (kaam_geo_synced_v1) in localStorage so the application never prompts the user again in subsequent sessions.</w:t>
+      </w:r>
+    </w:p>
+    <w:p>
+      <w:pPr>
+        <w:spacing w:after="80" w:line="276" w:lineRule="auto"/>
+      </w:pPr>
+      <w:r>
+        <w:rPr>
+          <w:rFonts w:ascii="Arial" w:hAnsi="Arial"/>
+          <w:b/>
+          <w:color w:val="1E293B"/>
+          <w:sz w:val="19"/>
+        </w:rPr>
+        <w:t xml:space="preserve">• Server Database Coordinate Sync: </w:t>
+      </w:r>
+      <w:r>
+        <w:rPr>
+          <w:rFonts w:ascii="Arial" w:hAnsi="Arial"/>
+          <w:i w:val="0"/>
+          <w:color w:val="1E293B"/>
+          <w:sz w:val="19"/>
+        </w:rPr>
+        <w:t>Dispatches background coordinates to POST /api/auth/update-location and stores latitude and longitude in users and worker_profiles tables.</w:t>
+      </w:r>
+    </w:p>
+    <w:p>
+      <w:pPr>
+        <w:spacing w:after="80" w:line="276" w:lineRule="auto"/>
+      </w:pPr>
+      <w:r>
+        <w:rPr>
+          <w:rFonts w:ascii="Arial" w:hAnsi="Arial"/>
+          <w:b/>
+          <w:color w:val="1E293B"/>
+          <w:sz w:val="19"/>
+        </w:rPr>
+        <w:t xml:space="preserve">• Haversine Distance Engine: </w:t>
+      </w:r>
+      <w:r>
+        <w:rPr>
+          <w:rFonts w:ascii="Arial" w:hAnsi="Arial"/>
+          <w:i w:val="0"/>
+          <w:color w:val="1E293B"/>
+          <w:sz w:val="19"/>
+        </w:rPr>
+        <w:t>Mathematical Haversine formula implemented to calculate real-world distance in km for upcoming 5 km radius range filtering.</w:t>
+      </w:r>
+    </w:p>
+    <w:p>
+      <w:pPr>
+        <w:pStyle w:val="Heading2"/>
+        <w:spacing w:before="280" w:after="80"/>
+      </w:pPr>
+      <w:r>
+        <w:rPr>
+          <w:rFonts w:ascii="Arial" w:hAnsi="Arial"/>
+          <w:b/>
+          <w:color w:val="913B82"/>
+          <w:sz w:val="25"/>
+        </w:rPr>
+        <w:t>D. Authentication &amp; Security Systems</w:t>
       </w:r>
     </w:p>
     <w:p>
@@ -643,17 +987,20 @@
     </w:p>
     <w:p>
       <w:pPr>
-        <w:pStyle w:val="Heading2"/>
-        <w:spacing w:before="280" w:after="80"/>
+        <w:pStyle w:val="Heading1"/>
+        <w:spacing w:before="360" w:after="120"/>
+        <w:pBdr>
+          <w:bottom w:val="single" w:sz="6" w:space="1" w:color="59267C"/>
+        </w:pBdr>
       </w:pPr>
       <w:r>
         <w:rPr>
           <w:rFonts w:ascii="Arial" w:hAnsi="Arial"/>
           <w:b/>
-          <w:color w:val="913B82"/>
-          <w:sz w:val="25"/>
+          <w:color w:val="2D1B4E"/>
+          <w:sz w:val="32"/>
         </w:rPr>
-        <w:t>B. Master Admin Portal &amp; Security Controls</w:t>
+        <w:t>3. Tomorrow's Development Roadmap: Worker Site Essential Upgrades</w:t>
       </w:r>
     </w:p>
     <w:p>
@@ -663,181 +1010,11 @@
       <w:r>
         <w:rPr>
           <w:rFonts w:ascii="Arial" w:hAnsi="Arial"/>
-          <w:b/>
-          <w:color w:val="1E293B"/>
-          <w:sz w:val="19"/>
-        </w:rPr>
-        <w:t xml:space="preserve">• Master Admin Credentials: </w:t>
-      </w:r>
-      <w:r>
-        <w:rPr>
-          <w:rFonts w:ascii="Arial" w:hAnsi="Arial"/>
           <w:i w:val="0"/>
           <w:color w:val="1E293B"/>
           <w:sz w:val="19"/>
         </w:rPr>
-        <w:t>Configured Master Admin ID Surya-4034 with encrypted bcrypt password storage in SQLite database.</w:t>
-      </w:r>
-    </w:p>
-    <w:p>
-      <w:pPr>
-        <w:spacing w:after="80" w:line="276" w:lineRule="auto"/>
-      </w:pPr>
-      <w:r>
-        <w:rPr>
-          <w:rFonts w:ascii="Arial" w:hAnsi="Arial"/>
-          <w:b/>
-          <w:color w:val="1E293B"/>
-          <w:sz w:val="19"/>
-        </w:rPr>
-        <w:t xml:space="preserve">• Real-Time Login Alerts: </w:t>
-      </w:r>
-      <w:r>
-        <w:rPr>
-          <w:rFonts w:ascii="Arial" w:hAnsi="Arial"/>
-          <w:i w:val="0"/>
-          <w:color w:val="1E293B"/>
-          <w:sz w:val="19"/>
-        </w:rPr>
-        <w:t>Automated email alert dispatched to kaamadmin@gmail.com instantly upon successful login.</w:t>
-      </w:r>
-    </w:p>
-    <w:p>
-      <w:pPr>
-        <w:spacing w:after="80" w:line="276" w:lineRule="auto"/>
-      </w:pPr>
-      <w:r>
-        <w:rPr>
-          <w:rFonts w:ascii="Arial" w:hAnsi="Arial"/>
-          <w:b/>
-          <w:color w:val="1E293B"/>
-          <w:sz w:val="19"/>
-        </w:rPr>
-        <w:t xml:space="preserve">• Admin Secret Code Flow: </w:t>
-      </w:r>
-      <w:r>
-        <w:rPr>
-          <w:rFonts w:ascii="Arial" w:hAnsi="Arial"/>
-          <w:i w:val="0"/>
-          <w:color w:val="1E293B"/>
-          <w:sz w:val="19"/>
-        </w:rPr>
-        <w:t>Clicking 'Forgot Password?' dispatches secret code to kaamadmin@gmail.com and opens the 'TYPE ADMIN SECRET CODE' verification screen.</w:t>
-      </w:r>
-    </w:p>
-    <w:p>
-      <w:pPr>
-        <w:spacing w:after="80" w:line="276" w:lineRule="auto"/>
-      </w:pPr>
-      <w:r>
-        <w:rPr>
-          <w:rFonts w:ascii="Arial" w:hAnsi="Arial"/>
-          <w:b/>
-          <w:color w:val="1E293B"/>
-          <w:sz w:val="19"/>
-        </w:rPr>
-        <w:t xml:space="preserve">• Streamlined Verification UI: </w:t>
-      </w:r>
-      <w:r>
-        <w:rPr>
-          <w:rFonts w:ascii="Arial" w:hAnsi="Arial"/>
-          <w:i w:val="0"/>
-          <w:color w:val="1E293B"/>
-          <w:sz w:val="19"/>
-        </w:rPr>
-        <w:t>Secret code verification screen heading reads 'TYPE ADMIN SECRET CODE' with all email text lines removed for maximum privacy.</w:t>
-      </w:r>
-    </w:p>
-    <w:p>
-      <w:pPr>
-        <w:spacing w:after="80" w:line="276" w:lineRule="auto"/>
-      </w:pPr>
-      <w:r>
-        <w:rPr>
-          <w:rFonts w:ascii="Arial" w:hAnsi="Arial"/>
-          <w:b/>
-          <w:color w:val="1E293B"/>
-          <w:sz w:val="19"/>
-        </w:rPr>
-        <w:t xml:space="preserve">• Eye Password Visibility Toggle: </w:t>
-      </w:r>
-      <w:r>
-        <w:rPr>
-          <w:rFonts w:ascii="Arial" w:hAnsi="Arial"/>
-          <w:i w:val="0"/>
-          <w:color w:val="1E293B"/>
-          <w:sz w:val="19"/>
-        </w:rPr>
-        <w:t>Interactive Eye icon (Eye / EyeOff) on the login Key field and reset confirm password field to toggle text visibility.</w:t>
-      </w:r>
-    </w:p>
-    <w:p>
-      <w:pPr>
-        <w:spacing w:after="80" w:line="276" w:lineRule="auto"/>
-      </w:pPr>
-      <w:r>
-        <w:rPr>
-          <w:rFonts w:ascii="Arial" w:hAnsi="Arial"/>
-          <w:b/>
-          <w:color w:val="1E293B"/>
-          <w:sz w:val="19"/>
-        </w:rPr>
-        <w:t xml:space="preserve">• Strict Password Invalidation: </w:t>
-      </w:r>
-      <w:r>
-        <w:rPr>
-          <w:rFonts w:ascii="Arial" w:hAnsi="Arial"/>
-          <w:i w:val="0"/>
-          <w:color w:val="1E293B"/>
-          <w:sz w:val="19"/>
-        </w:rPr>
-        <w:t>Authentication strictly checks bcrypt password hash stored in database. Resetting password invalidates old password immediately.</w:t>
-      </w:r>
-    </w:p>
-    <w:p>
-      <w:pPr>
-        <w:spacing w:after="80" w:line="276" w:lineRule="auto"/>
-      </w:pPr>
-      <w:r>
-        <w:rPr>
-          <w:rFonts w:ascii="Arial" w:hAnsi="Arial"/>
-          <w:b/>
-          <w:color w:val="1E293B"/>
-          <w:sz w:val="19"/>
-        </w:rPr>
-        <w:t xml:space="preserve">• Session &amp; Form State Clearing: </w:t>
-      </w:r>
-      <w:r>
-        <w:rPr>
-          <w:rFonts w:ascii="Arial" w:hAnsi="Arial"/>
-          <w:i w:val="0"/>
-          <w:color w:val="1E293B"/>
-          <w:sz w:val="19"/>
-        </w:rPr>
-        <w:t>Signing out immediately clears all input states (adminId, password, secretCode) requiring manual re-entry.</w:t>
-      </w:r>
-    </w:p>
-    <w:p>
-      <w:pPr>
-        <w:spacing w:after="80" w:line="276" w:lineRule="auto"/>
-      </w:pPr>
-      <w:r>
-        <w:rPr>
-          <w:rFonts w:ascii="Arial" w:hAnsi="Arial"/>
-          <w:b/>
-          <w:color w:val="1E293B"/>
-          <w:sz w:val="19"/>
-        </w:rPr>
-        <w:t xml:space="preserve">• 4 Core Control Sections: </w:t>
-      </w:r>
-      <w:r>
-        <w:rPr>
-          <w:rFonts w:ascii="Arial" w:hAnsi="Arial"/>
-          <w:i w:val="0"/>
-          <w:color w:val="1E293B"/>
-          <w:sz w:val="19"/>
-        </w:rPr>
-        <w:t>Features 4 dedicated control sections: Homeowner Clients, Tradespeople Workers, Pending KYC Submissions Queue, and 36-Hour Dues Audit Ledger.</w:t>
+        <w:t>Starting tomorrow, development will pivot to upgrading the Worker Platform (Port 5175) to mirror all client-side standards:</w:t>
       </w:r>
     </w:p>
     <w:p>
@@ -852,7 +1029,7 @@
           <w:color w:val="913B82"/>
           <w:sz w:val="25"/>
         </w:rPr>
-        <w:t>C. Production Aesthetics &amp; Visual Background Themes</w:t>
+        <w:t>Unit 1: Worker Comprehensive Onboarding Wizard</w:t>
       </w:r>
     </w:p>
     <w:p>
@@ -862,20 +1039,11 @@
       <w:r>
         <w:rPr>
           <w:rFonts w:ascii="Arial" w:hAnsi="Arial"/>
-          <w:b/>
-          <w:color w:val="1E293B"/>
-          <w:sz w:val="19"/>
-        </w:rPr>
-        <w:t xml:space="preserve">• Client App Theme: </w:t>
-      </w:r>
-      <w:r>
-        <w:rPr>
-          <w:rFonts w:ascii="Arial" w:hAnsi="Arial"/>
           <w:i w:val="0"/>
           <w:color w:val="1E293B"/>
           <w:sz w:val="19"/>
         </w:rPr>
-        <w:t>Deep Forest Emerald Teal &amp; Warm Amber/Gold theme with HD home architecture background photo overlay.</w:t>
+        <w:t>Step 1: Trade category selection (Plumber, Electrician, Carpenter, Painter, Mason, AC Technician, Welder) and trade title.</w:t>
       </w:r>
     </w:p>
     <w:p>
@@ -885,20 +1053,11 @@
       <w:r>
         <w:rPr>
           <w:rFonts w:ascii="Arial" w:hAnsi="Arial"/>
-          <w:b/>
-          <w:color w:val="1E293B"/>
-          <w:sz w:val="19"/>
-        </w:rPr>
-        <w:t xml:space="preserve">• Master Admin Portal Theme: </w:t>
-      </w:r>
-      <w:r>
-        <w:rPr>
-          <w:rFonts w:ascii="Arial" w:hAnsi="Arial"/>
           <w:i w:val="0"/>
           <w:color w:val="1E293B"/>
           <w:sz w:val="19"/>
         </w:rPr>
-        <w:t>Blue Street Cyan Corporate theme with HD city grid background image, dark slate navbar, and electric top accent line.</w:t>
+        <w:t>Step 2: Pricing configuration (Daily wage rate ₹/day and hourly rate ₹/hr) and experience years.</w:t>
       </w:r>
     </w:p>
     <w:p>
@@ -908,12 +1067,17 @@
       <w:r>
         <w:rPr>
           <w:rFonts w:ascii="Arial" w:hAnsi="Arial"/>
-          <w:b/>
+          <w:i w:val="0"/>
           <w:color w:val="1E293B"/>
           <w:sz w:val="19"/>
         </w:rPr>
-        <w:t xml:space="preserve">• Worker App Theme: </w:t>
+        <w:t>Step 3: Identity &amp; Banking details (Aadhaar number, Bank account, Bank name, IFSC code, and direct UPI ID for instant cashout).</w:t>
       </w:r>
+    </w:p>
+    <w:p>
+      <w:pPr>
+        <w:spacing w:after="80" w:line="276" w:lineRule="auto"/>
+      </w:pPr>
       <w:r>
         <w:rPr>
           <w:rFonts w:ascii="Arial" w:hAnsi="Arial"/>
@@ -921,7 +1085,7 @@
           <w:color w:val="1E293B"/>
           <w:sz w:val="19"/>
         </w:rPr>
-        <w:t>Skilled trades craftsman amber/slate theme with HD engineering tools background photo overlay.</w:t>
+        <w:t>Step 4: Past work portfolio photo uploads and custom bio description.</w:t>
       </w:r>
     </w:p>
     <w:p>
@@ -936,71 +1100,7 @@
           <w:color w:val="913B82"/>
           <w:sz w:val="25"/>
         </w:rPr>
-        <w:t>D. Project Architecture &amp; Workspace Organization</w:t>
-      </w:r>
-    </w:p>
-    <w:p>
-      <w:pPr>
-        <w:spacing w:after="80" w:line="276" w:lineRule="auto"/>
-      </w:pPr>
-      <w:r>
-        <w:rPr>
-          <w:rFonts w:ascii="Arial" w:hAnsi="Arial"/>
-          <w:b/>
-          <w:color w:val="1E293B"/>
-          <w:sz w:val="19"/>
-        </w:rPr>
-        <w:t xml:space="preserve">• Single-Command Process Launcher: </w:t>
-      </w:r>
-      <w:r>
-        <w:rPr>
-          <w:rFonts w:ascii="Arial" w:hAnsi="Arial"/>
-          <w:i w:val="0"/>
-          <w:color w:val="1E293B"/>
-          <w:sz w:val="19"/>
-        </w:rPr>
-        <w:t>Unified multi-service process launcher (npm start via start-services.js) executing all 4 local microservices concurrently.</w:t>
-      </w:r>
-    </w:p>
-    <w:p>
-      <w:pPr>
-        <w:spacing w:after="80" w:line="276" w:lineRule="auto"/>
-      </w:pPr>
-      <w:r>
-        <w:rPr>
-          <w:rFonts w:ascii="Arial" w:hAnsi="Arial"/>
-          <w:b/>
-          <w:color w:val="1E293B"/>
-          <w:sz w:val="19"/>
-        </w:rPr>
-        <w:t xml:space="preserve">• Clean Workspace Structure: </w:t>
-      </w:r>
-      <w:r>
-        <w:rPr>
-          <w:rFonts w:ascii="Arial" w:hAnsi="Arial"/>
-          <w:i w:val="0"/>
-          <w:color w:val="1E293B"/>
-          <w:sz w:val="19"/>
-        </w:rPr>
-        <w:t>Organized 21 Playwright test scripts and 18 visual screenshot artifacts into dedicated tests/ and tests/screenshots/ directories.</w:t>
-      </w:r>
-    </w:p>
-    <w:p>
-      <w:pPr>
-        <w:pStyle w:val="Heading1"/>
-        <w:spacing w:before="360" w:after="120"/>
-        <w:pBdr>
-          <w:bottom w:val="single" w:sz="6" w:space="1" w:color="59267C"/>
-        </w:pBdr>
-      </w:pPr>
-      <w:r>
-        <w:rPr>
-          <w:rFonts w:ascii="Arial" w:hAnsi="Arial"/>
-          <w:b/>
-          <w:color w:val="2D1B4E"/>
-          <w:sz w:val="32"/>
-        </w:rPr>
-        <w:t>3. Future Development Roadmap to Achieve Main Goal</w:t>
+        <w:t>Unit 2: Worker Dashboard &amp; Incoming Job Radius Filtering (5 km)</w:t>
       </w:r>
     </w:p>
     <w:p>
@@ -1014,7 +1114,21 @@
           <w:color w:val="1E293B"/>
           <w:sz w:val="19"/>
         </w:rPr>
-        <w:t>To achieve our overarching goal of transforming kaam into India's #1 digital trades platform, the upcoming development phases are structured into 4 core units:</w:t>
+        <w:t>Implement 5 km geographical radius filtering so workers only receive job alerts occurring within 5 km of their live location.</w:t>
+      </w:r>
+    </w:p>
+    <w:p>
+      <w:pPr>
+        <w:spacing w:after="80" w:line="276" w:lineRule="auto"/>
+      </w:pPr>
+      <w:r>
+        <w:rPr>
+          <w:rFonts w:ascii="Arial" w:hAnsi="Arial"/>
+          <w:i w:val="0"/>
+          <w:color w:val="1E293B"/>
+          <w:sz w:val="19"/>
+        </w:rPr>
+        <w:t>Real-time job accept/reject actions with direct calling and navigation routes.</w:t>
       </w:r>
     </w:p>
     <w:p>
@@ -1029,7 +1143,7 @@
           <w:color w:val="913B82"/>
           <w:sz w:val="25"/>
         </w:rPr>
-        <w:t>Unit 2: Client &amp; Worker Post-Registration Detail Collection Wizards</w:t>
+        <w:t>Unit 3: Automated 36-Hour Platform Commission Dues Monitoring &amp; Settlement</w:t>
       </w:r>
     </w:p>
     <w:p>
@@ -1043,140 +1157,7 @@
           <w:color w:val="1E293B"/>
           <w:sz w:val="19"/>
         </w:rPr>
-        <w:t>Build post-registration wizards to collect full profile &amp; trade details from newly registered users after sign up:</w:t>
-      </w:r>
-    </w:p>
-    <w:p>
-      <w:pPr>
-        <w:spacing w:after="80" w:line="276" w:lineRule="auto"/>
-      </w:pPr>
-      <w:r>
-        <w:rPr>
-          <w:rFonts w:ascii="Arial" w:hAnsi="Arial"/>
-          <w:b/>
-          <w:color w:val="1E293B"/>
-          <w:sz w:val="19"/>
-        </w:rPr>
-        <w:t xml:space="preserve">• Client Detail Collection: </w:t>
-      </w:r>
-      <w:r>
-        <w:rPr>
-          <w:rFonts w:ascii="Arial" w:hAnsi="Arial"/>
-          <w:i w:val="0"/>
-          <w:color w:val="1E293B"/>
-          <w:sz w:val="19"/>
-        </w:rPr>
-        <w:t>Collect secondary phone number, home/site address, preferred work timings, and project requirements.</w:t>
-      </w:r>
-    </w:p>
-    <w:p>
-      <w:pPr>
-        <w:spacing w:after="80" w:line="276" w:lineRule="auto"/>
-      </w:pPr>
-      <w:r>
-        <w:rPr>
-          <w:rFonts w:ascii="Arial" w:hAnsi="Arial"/>
-          <w:b/>
-          <w:color w:val="1E293B"/>
-          <w:sz w:val="19"/>
-        </w:rPr>
-        <w:t xml:space="preserve">• Worker Trade Onboarding: </w:t>
-      </w:r>
-      <w:r>
-        <w:rPr>
-          <w:rFonts w:ascii="Arial" w:hAnsi="Arial"/>
-          <w:i w:val="0"/>
-          <w:color w:val="1E293B"/>
-          <w:sz w:val="19"/>
-        </w:rPr>
-        <w:t>Collect trade specialization (Plumber, Electrician, Mistry, Painter, Mason, Carpenter, Welder), daily wage fee (₹/day), hourly rate (₹/hr), experience years, Aadhaar number, bank account, IFSC code, direct UPI ID, and portfolio work photos.</w:t>
-      </w:r>
-    </w:p>
-    <w:p>
-      <w:pPr>
-        <w:pStyle w:val="Heading2"/>
-        <w:spacing w:before="280" w:after="80"/>
-      </w:pPr>
-      <w:r>
-        <w:rPr>
-          <w:rFonts w:ascii="Arial" w:hAnsi="Arial"/>
-          <w:b/>
-          <w:color w:val="913B82"/>
-          <w:sz w:val="25"/>
-        </w:rPr>
-        <w:t>Unit 3: Job Posting, Radius Filtering &amp; Worker Marketplace</w:t>
-      </w:r>
-    </w:p>
-    <w:p>
-      <w:pPr>
-        <w:spacing w:after="80" w:line="276" w:lineRule="auto"/>
-      </w:pPr>
-      <w:r>
-        <w:rPr>
-          <w:rFonts w:ascii="Arial" w:hAnsi="Arial"/>
-          <w:i w:val="0"/>
-          <w:color w:val="1E293B"/>
-          <w:sz w:val="19"/>
-        </w:rPr>
-        <w:t>Implement job creation, worker discovery, radius filtering, emergency 1-hour dispatch, and worker rating system.</w:t>
-      </w:r>
-    </w:p>
-    <w:p>
-      <w:pPr>
-        <w:pStyle w:val="Heading2"/>
-        <w:spacing w:before="280" w:after="80"/>
-      </w:pPr>
-      <w:r>
-        <w:rPr>
-          <w:rFonts w:ascii="Arial" w:hAnsi="Arial"/>
-          <w:b/>
-          <w:color w:val="913B82"/>
-          <w:sz w:val="25"/>
-        </w:rPr>
-        <w:t>Unit 4: Automated 36-Hour Platform Commission Dues Monitoring &amp; Settlement</w:t>
-      </w:r>
-    </w:p>
-    <w:p>
-      <w:pPr>
-        <w:spacing w:after="80" w:line="276" w:lineRule="auto"/>
-      </w:pPr>
-      <w:r>
-        <w:rPr>
-          <w:rFonts w:ascii="Arial" w:hAnsi="Arial"/>
-          <w:i w:val="0"/>
-          <w:color w:val="1E293B"/>
-          <w:sz w:val="19"/>
-        </w:rPr>
-        <w:t>Track 10% platform commission fee on cash jobs, display 36h countdown timer, integrate UPI payment link, and trigger automated account locking upon 36h expiry.</w:t>
-      </w:r>
-    </w:p>
-    <w:p>
-      <w:pPr>
-        <w:pStyle w:val="Heading2"/>
-        <w:spacing w:before="280" w:after="80"/>
-      </w:pPr>
-      <w:r>
-        <w:rPr>
-          <w:rFonts w:ascii="Arial" w:hAnsi="Arial"/>
-          <w:b/>
-          <w:color w:val="913B82"/>
-          <w:sz w:val="25"/>
-        </w:rPr>
-        <w:t>Unit 5: In-App Real-Time Chat, Direct Phone Calling &amp; Live Progress Tracker</w:t>
-      </w:r>
-    </w:p>
-    <w:p>
-      <w:pPr>
-        <w:spacing w:after="80" w:line="276" w:lineRule="auto"/>
-      </w:pPr>
-      <w:r>
-        <w:rPr>
-          <w:rFonts w:ascii="Arial" w:hAnsi="Arial"/>
-          <w:i w:val="0"/>
-          <w:color w:val="1E293B"/>
-          <w:sz w:val="19"/>
-        </w:rPr>
-        <w:t>Socket.io real-time chat, direct click-to-call phone links, and live job status tracking (Requested -&gt; Accepted -&gt; On The Way -&gt; In Progress -&gt; Completed -&gt; Paid).</w:t>
+        <w:t>Automated 10% commission calculation on completed cash jobs, 36-hour countdown timer, UPI QR settlement, and automated locking upon overdue payment.</w:t>
       </w:r>
     </w:p>
     <w:sectPr>

</xml_diff>